<commit_message>
fix: adjust formatting in Solution File Exercise 2 for improved clarity
</commit_message>
<xml_diff>
--- a/Hands-on Exercises/Exercise 2/Solution File Exercise 2.docx
+++ b/Hands-on Exercises/Exercise 2/Solution File Exercise 2.docx
@@ -983,8 +983,8 @@
         </w:rPr>
         <w:drawing>
           <wp:inline distT="0" distB="0" distL="0" distR="0" wp14:anchorId="4DFB63B2" wp14:editId="42015DFF">
-            <wp:extent cx="5943600" cy="4225290"/>
-            <wp:effectExtent l="0" t="0" r="0" b="3810"/>
+            <wp:extent cx="5600700" cy="3981523"/>
+            <wp:effectExtent l="0" t="0" r="0" b="0"/>
             <wp:docPr id="27" name="Picture 27"/>
             <wp:cNvGraphicFramePr>
               <a:graphicFrameLocks xmlns:a="http://schemas.openxmlformats.org/drawingml/2006/main" noChangeAspect="1"/>
@@ -1005,7 +1005,7 @@
                   <pic:spPr>
                     <a:xfrm>
                       <a:off x="0" y="0"/>
-                      <a:ext cx="5943600" cy="4225290"/>
+                      <a:ext cx="5601818" cy="3982318"/>
                     </a:xfrm>
                     <a:prstGeom prst="rect">
                       <a:avLst/>
@@ -1027,11 +1027,10 @@
         <w:rPr>
           <w:noProof/>
         </w:rPr>
-        <w:lastRenderedPageBreak/>
         <w:drawing>
           <wp:inline distT="0" distB="0" distL="0" distR="0" wp14:anchorId="100FE274" wp14:editId="256D3EEC">
-            <wp:extent cx="5943600" cy="4225290"/>
-            <wp:effectExtent l="0" t="0" r="0" b="3810"/>
+            <wp:extent cx="5332625" cy="3790950"/>
+            <wp:effectExtent l="0" t="0" r="1905" b="0"/>
             <wp:docPr id="28" name="Picture 28"/>
             <wp:cNvGraphicFramePr>
               <a:graphicFrameLocks xmlns:a="http://schemas.openxmlformats.org/drawingml/2006/main" noChangeAspect="1"/>
@@ -1052,7 +1051,7 @@
                   <pic:spPr>
                     <a:xfrm>
                       <a:off x="0" y="0"/>
-                      <a:ext cx="5943600" cy="4225290"/>
+                      <a:ext cx="5337531" cy="3794438"/>
                     </a:xfrm>
                     <a:prstGeom prst="rect">
                       <a:avLst/>
@@ -1083,6 +1082,10 @@
       <w:pPr>
         <w:spacing w:after="100" w:line="240" w:lineRule="auto"/>
         <w:jc w:val="center"/>
+        <w:rPr>
+          <w:b/>
+          <w:sz w:val="28"/>
+        </w:rPr>
       </w:pPr>
       <w:r>
         <w:rPr>
@@ -1090,8 +1093,8 @@
         </w:rPr>
         <w:drawing>
           <wp:inline distT="0" distB="0" distL="0" distR="0" wp14:anchorId="57B16D55" wp14:editId="1E25FE7E">
-            <wp:extent cx="5943600" cy="4225290"/>
-            <wp:effectExtent l="0" t="0" r="0" b="3810"/>
+            <wp:extent cx="5095875" cy="3622644"/>
+            <wp:effectExtent l="0" t="0" r="0" b="0"/>
             <wp:docPr id="29" name="Picture 29"/>
             <wp:cNvGraphicFramePr>
               <a:graphicFrameLocks xmlns:a="http://schemas.openxmlformats.org/drawingml/2006/main" noChangeAspect="1"/>
@@ -1112,7 +1115,7 @@
                   <pic:spPr>
                     <a:xfrm>
                       <a:off x="0" y="0"/>
-                      <a:ext cx="5943600" cy="4225290"/>
+                      <a:ext cx="5100702" cy="3626076"/>
                     </a:xfrm>
                     <a:prstGeom prst="rect">
                       <a:avLst/>
@@ -1126,37 +1129,29 @@
       </w:r>
     </w:p>
     <w:p>
-      <w:r>
-        <w:br w:type="page"/>
-      </w:r>
-    </w:p>
-    <w:p>
-      <w:pPr>
-        <w:keepNext/>
-        <w:spacing w:before="140" w:after="120" w:line="240" w:lineRule="auto"/>
+      <w:pPr>
+        <w:spacing w:after="100" w:line="240" w:lineRule="auto"/>
+        <w:jc w:val="center"/>
+        <w:rPr>
+          <w:b/>
+          <w:sz w:val="28"/>
+        </w:rPr>
       </w:pPr>
       <w:r>
         <w:rPr>
           <w:b/>
           <w:sz w:val="28"/>
         </w:rPr>
-        <w:lastRenderedPageBreak/>
         <w:t>Browser Output:</w:t>
       </w:r>
-    </w:p>
-    <w:p>
-      <w:pPr>
-        <w:spacing w:after="100" w:line="240" w:lineRule="auto"/>
-        <w:jc w:val="center"/>
-      </w:pPr>
       <w:r>
         <w:rPr>
           <w:noProof/>
         </w:rPr>
         <w:drawing>
           <wp:inline distT="0" distB="0" distL="0" distR="0" wp14:anchorId="1831AB30" wp14:editId="46F77FAB">
-            <wp:extent cx="5943600" cy="4225290"/>
-            <wp:effectExtent l="0" t="0" r="0" b="3810"/>
+            <wp:extent cx="5694387" cy="4048125"/>
+            <wp:effectExtent l="0" t="0" r="1905" b="0"/>
             <wp:docPr id="2" name="Picture 2"/>
             <wp:cNvGraphicFramePr>
               <a:graphicFrameLocks xmlns:a="http://schemas.openxmlformats.org/drawingml/2006/main" noChangeAspect="1"/>
@@ -1177,7 +1172,7 @@
                   <pic:spPr>
                     <a:xfrm>
                       <a:off x="0" y="0"/>
-                      <a:ext cx="5943600" cy="4225290"/>
+                      <a:ext cx="5708946" cy="4058475"/>
                     </a:xfrm>
                     <a:prstGeom prst="rect">
                       <a:avLst/>
@@ -1190,11 +1185,7 @@
         </w:drawing>
       </w:r>
     </w:p>
-    <w:p>
-      <w:r>
-        <w:br w:type="page"/>
-      </w:r>
-    </w:p>
+    <w:p/>
     <w:p>
       <w:pPr>
         <w:pStyle w:val="ListParagraph"/>
@@ -1206,7 +1197,6 @@
           <w:b/>
           <w:sz w:val="36"/>
         </w:rPr>
-        <w:lastRenderedPageBreak/>
         <w:t>Part 3: Track Cart Items using React State and Events. (Marks 1)</w:t>
       </w:r>
     </w:p>
@@ -1339,19 +1329,15 @@
       </w:r>
     </w:p>
     <w:p>
-      <w:pPr>
-        <w:spacing w:after="100" w:line="240" w:lineRule="auto"/>
-        <w:jc w:val="center"/>
-      </w:pPr>
       <w:r>
         <w:rPr>
           <w:noProof/>
         </w:rPr>
         <w:drawing>
-          <wp:inline distT="0" distB="0" distL="0" distR="0" wp14:anchorId="19F6E755" wp14:editId="63E8455E">
-            <wp:extent cx="5943600" cy="4231640"/>
-            <wp:effectExtent l="0" t="0" r="0" b="0"/>
-            <wp:docPr id="4" name="Picture 4"/>
+          <wp:inline distT="0" distB="0" distL="0" distR="0">
+            <wp:extent cx="5943600" cy="4144879"/>
+            <wp:effectExtent l="0" t="0" r="0" b="8255"/>
+            <wp:docPr id="3" name="Picture 3" descr="output 2.png (1216×848)"/>
             <wp:cNvGraphicFramePr>
               <a:graphicFrameLocks xmlns:a="http://schemas.openxmlformats.org/drawingml/2006/main" noChangeAspect="1"/>
             </wp:cNvGraphicFramePr>
@@ -1359,23 +1345,36 @@
               <a:graphicData uri="http://schemas.openxmlformats.org/drawingml/2006/picture">
                 <pic:pic xmlns:pic="http://schemas.openxmlformats.org/drawingml/2006/picture">
                   <pic:nvPicPr>
-                    <pic:cNvPr id="1" name=""/>
-                    <pic:cNvPicPr/>
+                    <pic:cNvPr id="0" name="Picture 1" descr="output 2.png (1216×848)"/>
+                    <pic:cNvPicPr>
+                      <a:picLocks noChangeAspect="1" noChangeArrowheads="1"/>
+                    </pic:cNvPicPr>
                   </pic:nvPicPr>
                   <pic:blipFill>
-                    <a:blip r:embed="rId20"/>
+                    <a:blip r:embed="rId20">
+                      <a:extLst>
+                        <a:ext uri="{28A0092B-C50C-407E-A947-70E740481C1C}">
+                          <a14:useLocalDpi xmlns:a14="http://schemas.microsoft.com/office/drawing/2010/main" val="0"/>
+                        </a:ext>
+                      </a:extLst>
+                    </a:blip>
+                    <a:srcRect/>
                     <a:stretch>
                       <a:fillRect/>
                     </a:stretch>
                   </pic:blipFill>
-                  <pic:spPr>
+                  <pic:spPr bwMode="auto">
                     <a:xfrm>
                       <a:off x="0" y="0"/>
-                      <a:ext cx="5943600" cy="4231640"/>
+                      <a:ext cx="5943600" cy="4144879"/>
                     </a:xfrm>
                     <a:prstGeom prst="rect">
                       <a:avLst/>
                     </a:prstGeom>
+                    <a:noFill/>
+                    <a:ln>
+                      <a:noFill/>
+                    </a:ln>
                   </pic:spPr>
                 </pic:pic>
               </a:graphicData>
@@ -13317,7 +13316,7 @@
 </file>
 
 <file path=customXml/itemProps1.xml><?xml version="1.0" encoding="utf-8"?>
-<ds:datastoreItem xmlns:ds="http://schemas.openxmlformats.org/officeDocument/2006/customXml" ds:itemID="{24D4A78D-B198-45F3-AE35-8A58C9815B56}">
+<ds:datastoreItem xmlns:ds="http://schemas.openxmlformats.org/officeDocument/2006/customXml" ds:itemID="{3AC41795-55B3-4410-B33D-1300EE348D2C}">
   <ds:schemaRefs>
     <ds:schemaRef ds:uri="http://schemas.openxmlformats.org/officeDocument/2006/bibliography"/>
   </ds:schemaRefs>

</xml_diff>